<commit_message>
updated one of the projects in Resume
</commit_message>
<xml_diff>
--- a/images/Hamza_Salahuddin_Resume.docx
+++ b/images/Hamza_Salahuddin_Resume.docx
@@ -32,8 +32,40 @@
           <w:sz w:val="22"/>
           <w:szCs w:val="28"/>
         </w:rPr>
-        <w:t>Macon, GA | 478-305-1808 | mazeadone@gmail.com</w:t>
-      </w:r>
+        <w:t xml:space="preserve">Macon, GA | 478-305-1808 | </w:t>
+      </w:r>
+      <w:hyperlink r:id="rId6" w:history="1">
+        <w:r>
+          <w:rPr>
+            <w:rStyle w:val="Hyperlink"/>
+            <w:color w:val="000000" w:themeColor="text1"/>
+            <w:sz w:val="22"/>
+            <w:szCs w:val="28"/>
+            <w:u w:val="none"/>
+          </w:rPr>
+          <w:t>mazeadone</w:t>
+        </w:r>
+        <w:r>
+          <w:rPr>
+            <w:rStyle w:val="Hyperlink"/>
+            <w:color w:val="000000" w:themeColor="text1"/>
+            <w:sz w:val="22"/>
+            <w:szCs w:val="28"/>
+            <w:u w:val="none"/>
+          </w:rPr>
+          <w:t>@</w:t>
+        </w:r>
+        <w:r>
+          <w:rPr>
+            <w:rStyle w:val="Hyperlink"/>
+            <w:color w:val="000000" w:themeColor="text1"/>
+            <w:sz w:val="22"/>
+            <w:szCs w:val="28"/>
+            <w:u w:val="none"/>
+          </w:rPr>
+          <w:t>gmail.com</w:t>
+        </w:r>
+      </w:hyperlink>
     </w:p>
     <w:p>
       <w:pPr>
@@ -43,14 +75,114 @@
           <w:szCs w:val="28"/>
         </w:rPr>
       </w:pPr>
+      <w:hyperlink r:id="rId7" w:history="1">
+        <w:r>
+          <w:rPr>
+            <w:rStyle w:val="Hyperlink"/>
+            <w:color w:val="auto"/>
+            <w:sz w:val="22"/>
+            <w:u w:val="none"/>
+          </w:rPr>
+          <w:t>hs14</w:t>
+        </w:r>
+        <w:r>
+          <w:rPr>
+            <w:rStyle w:val="Hyperlink"/>
+            <w:color w:val="auto"/>
+            <w:sz w:val="22"/>
+            <w:u w:val="none"/>
+          </w:rPr>
+          <w:t>2</w:t>
+        </w:r>
+        <w:r>
+          <w:rPr>
+            <w:rStyle w:val="Hyperlink"/>
+            <w:color w:val="auto"/>
+            <w:sz w:val="22"/>
+            <w:u w:val="none"/>
+          </w:rPr>
+          <w:t>35.github.io</w:t>
+        </w:r>
+      </w:hyperlink>
+      <w:r>
+        <w:rPr>
+          <w:sz w:val="22"/>
+          <w:szCs w:val="28"/>
+        </w:rPr>
+        <w:t xml:space="preserve"> | </w:t>
+      </w:r>
+      <w:hyperlink r:id="rId8" w:history="1">
+        <w:r>
+          <w:rPr>
+            <w:rStyle w:val="Hyperlink"/>
+            <w:color w:val="auto"/>
+            <w:sz w:val="22"/>
+            <w:szCs w:val="28"/>
+            <w:u w:val="none"/>
+          </w:rPr>
+          <w:t>githu</w:t>
+        </w:r>
+        <w:r>
+          <w:rPr>
+            <w:rStyle w:val="Hyperlink"/>
+            <w:color w:val="auto"/>
+            <w:sz w:val="22"/>
+            <w:szCs w:val="28"/>
+            <w:u w:val="none"/>
+          </w:rPr>
+          <w:t>b</w:t>
+        </w:r>
+        <w:r>
+          <w:rPr>
+            <w:rStyle w:val="Hyperlink"/>
+            <w:color w:val="auto"/>
+            <w:sz w:val="22"/>
+            <w:szCs w:val="28"/>
+            <w:u w:val="none"/>
+          </w:rPr>
+          <w:t>.com/hs14235</w:t>
+        </w:r>
+      </w:hyperlink>
       <w:r>
         <w:rPr>
           <w:color w:val="222222"/>
           <w:sz w:val="22"/>
           <w:szCs w:val="28"/>
         </w:rPr>
-        <w:t>hs14235.github.io | github.com/hs14235 | linkedin.com/in/mrbesetti</w:t>
-      </w:r>
+        <w:t xml:space="preserve"> |</w:t>
+      </w:r>
+      <w:r>
+        <w:rPr>
+          <w:color w:val="000000" w:themeColor="text1"/>
+          <w:sz w:val="22"/>
+          <w:szCs w:val="28"/>
+        </w:rPr>
+        <w:t xml:space="preserve"> </w:t>
+      </w:r>
+      <w:hyperlink r:id="rId9" w:history="1">
+        <w:r>
+          <w:rPr>
+            <w:rStyle w:val="Hyperlink"/>
+            <w:color w:val="000000" w:themeColor="text1"/>
+            <w:sz w:val="22"/>
+            <w:szCs w:val="28"/>
+            <w:u w:val="none"/>
+          </w:rPr>
+          <w:t>linkedin.com/in/</w:t>
+        </w:r>
+        <w:proofErr w:type="spellStart"/>
+        <w:r>
+          <w:rPr>
+            <w:rStyle w:val="Hyperlink"/>
+            <w:color w:val="000000" w:themeColor="text1"/>
+            <w:sz w:val="22"/>
+            <w:szCs w:val="28"/>
+            <w:u w:val="none"/>
+          </w:rPr>
+          <w:t>mrbesetti</w:t>
+        </w:r>
+        <w:proofErr w:type="spellEnd"/>
+      </w:hyperlink>
     </w:p>
     <w:p>
       <w:pPr>
@@ -87,56 +219,37 @@
           <w:sz w:val="22"/>
           <w:szCs w:val="28"/>
         </w:rPr>
-        <w:t>Software engineer with a B.S. in Computer Science focused on full-stack, backend, and applied AI systems. Led a Gulfstream Aerospace capstone team developing an AI-powered 3D asset-generation platform</w:t>
-      </w:r>
-      <w:r>
-        <w:rPr>
-          <w:sz w:val="22"/>
-          <w:szCs w:val="28"/>
-        </w:rPr>
-        <w:t xml:space="preserve"> </w:t>
-      </w:r>
-      <w:r>
-        <w:rPr>
-          <w:sz w:val="22"/>
-          <w:szCs w:val="28"/>
-        </w:rPr>
-        <w:t>that reduced successful initial draft generation from multi-hour workflows to under 5 minutes.</w:t>
-      </w:r>
-      <w:r>
-        <w:rPr>
-          <w:sz w:val="22"/>
-          <w:szCs w:val="28"/>
-        </w:rPr>
-        <w:t xml:space="preserve"> </w:t>
-      </w:r>
-      <w:r>
-        <w:rPr>
-          <w:sz w:val="22"/>
-          <w:szCs w:val="28"/>
-        </w:rPr>
-        <w:t>B</w:t>
-      </w:r>
-      <w:r>
-        <w:rPr>
-          <w:sz w:val="22"/>
-          <w:szCs w:val="28"/>
-        </w:rPr>
-        <w:t>uilt additional systems spanning REST APIs, PostgreSQL data modeling, containerized deployment, and local RAG/LLM workflows using Python, Java,</w:t>
-      </w:r>
-      <w:r>
-        <w:rPr>
-          <w:sz w:val="22"/>
-          <w:szCs w:val="28"/>
-        </w:rPr>
-        <w:t xml:space="preserve"> PostgreSQL,</w:t>
-      </w:r>
-      <w:r>
-        <w:rPr>
-          <w:sz w:val="22"/>
-          <w:szCs w:val="28"/>
-        </w:rPr>
-        <w:t xml:space="preserve"> React, and Docker.</w:t>
+        <w:t>F</w:t>
+      </w:r>
+      <w:r>
+        <w:rPr>
+          <w:sz w:val="22"/>
+          <w:szCs w:val="28"/>
+        </w:rPr>
+        <w:t xml:space="preserve">ull-stack software engineer with backend depth in Python, Django, </w:t>
+      </w:r>
+      <w:proofErr w:type="spellStart"/>
+      <w:r>
+        <w:rPr>
+          <w:sz w:val="22"/>
+          <w:szCs w:val="28"/>
+        </w:rPr>
+        <w:t>FastAP</w:t>
+      </w:r>
+      <w:r>
+        <w:rPr>
+          <w:sz w:val="22"/>
+          <w:szCs w:val="28"/>
+        </w:rPr>
+        <w:t>I</w:t>
+      </w:r>
+      <w:proofErr w:type="spellEnd"/>
+      <w:r>
+        <w:rPr>
+          <w:sz w:val="22"/>
+          <w:szCs w:val="28"/>
+        </w:rPr>
+        <w:t xml:space="preserve">, PostgreSQL, React, and Docker. Builds tested systems spanning REST APIs, transactional data integrity, containerized environments, CI, applied AI, and interactive 3D workflows. Translates stakeholder requirements and independent research into ubiquitous implementations and practical, reliable solutions. </w:t>
       </w:r>
     </w:p>
     <w:p>
@@ -192,7 +305,15 @@
           <w:sz w:val="22"/>
           <w:szCs w:val="28"/>
         </w:rPr>
-        <w:t xml:space="preserve">   |   </w:t>
+        <w:t xml:space="preserve">   |  </w:t>
+      </w:r>
+      <w:r>
+        <w:rPr>
+          <w:color w:val="555555"/>
+          <w:sz w:val="22"/>
+          <w:szCs w:val="28"/>
+        </w:rPr>
+        <w:t xml:space="preserve">    </w:t>
       </w:r>
       <w:r>
         <w:rPr>
@@ -203,29 +324,87 @@
         </w:rPr>
         <w:t xml:space="preserve">Backend: </w:t>
       </w:r>
-      <w:r>
-        <w:rPr>
-          <w:color w:val="111111"/>
-          <w:sz w:val="22"/>
-          <w:szCs w:val="28"/>
-        </w:rPr>
-        <w:t>Django, FastAPI,</w:t>
-      </w:r>
-      <w:r>
-        <w:rPr>
-          <w:color w:val="111111"/>
-          <w:sz w:val="22"/>
-          <w:szCs w:val="28"/>
-        </w:rPr>
-        <w:t xml:space="preserve"> MCP,</w:t>
-      </w:r>
-      <w:r>
-        <w:rPr>
-          <w:color w:val="111111"/>
-          <w:sz w:val="22"/>
-          <w:szCs w:val="28"/>
-        </w:rPr>
-        <w:t xml:space="preserve"> Spring Boot, REST APIs</w:t>
+      <w:proofErr w:type="spellStart"/>
+      <w:r>
+        <w:rPr>
+          <w:color w:val="111111"/>
+          <w:sz w:val="22"/>
+          <w:szCs w:val="28"/>
+        </w:rPr>
+        <w:t>FastAPI</w:t>
+      </w:r>
+      <w:proofErr w:type="spellEnd"/>
+      <w:r>
+        <w:rPr>
+          <w:color w:val="111111"/>
+          <w:sz w:val="22"/>
+          <w:szCs w:val="28"/>
+        </w:rPr>
+        <w:t>,</w:t>
+      </w:r>
+      <w:r>
+        <w:rPr>
+          <w:color w:val="111111"/>
+          <w:sz w:val="22"/>
+          <w:szCs w:val="28"/>
+        </w:rPr>
+        <w:t xml:space="preserve"> </w:t>
+      </w:r>
+      <w:r>
+        <w:rPr>
+          <w:color w:val="111111"/>
+          <w:sz w:val="22"/>
+          <w:szCs w:val="28"/>
+        </w:rPr>
+        <w:t xml:space="preserve">Django, </w:t>
+      </w:r>
+      <w:r>
+        <w:rPr>
+          <w:color w:val="111111"/>
+          <w:sz w:val="22"/>
+          <w:szCs w:val="28"/>
+        </w:rPr>
+        <w:t xml:space="preserve">Node.js, </w:t>
+      </w:r>
+      <w:r>
+        <w:rPr>
+          <w:color w:val="111111"/>
+          <w:sz w:val="22"/>
+          <w:szCs w:val="28"/>
+        </w:rPr>
+        <w:t>Spring</w:t>
+      </w:r>
+      <w:r>
+        <w:rPr>
+          <w:color w:val="111111"/>
+          <w:sz w:val="22"/>
+          <w:szCs w:val="28"/>
+        </w:rPr>
+        <w:t xml:space="preserve"> Boot</w:t>
+      </w:r>
+      <w:r>
+        <w:rPr>
+          <w:color w:val="111111"/>
+          <w:sz w:val="22"/>
+          <w:szCs w:val="28"/>
+        </w:rPr>
+        <w:t>, Postman</w:t>
+      </w:r>
+      <w:r>
+        <w:rPr>
+          <w:color w:val="111111"/>
+          <w:sz w:val="22"/>
+          <w:szCs w:val="28"/>
+        </w:rPr>
+        <w:t xml:space="preserve"> </w:t>
+      </w:r>
+      <w:r>
+        <w:rPr>
+          <w:color w:val="111111"/>
+          <w:sz w:val="22"/>
+          <w:szCs w:val="28"/>
+        </w:rPr>
+        <w:t xml:space="preserve"> </w:t>
       </w:r>
     </w:p>
     <w:p>
@@ -275,6 +454,14 @@
           <w:sz w:val="22"/>
           <w:szCs w:val="28"/>
         </w:rPr>
+        <w:t xml:space="preserve">      </w:t>
+      </w:r>
+      <w:r>
+        <w:rPr>
+          <w:color w:val="111111"/>
+          <w:sz w:val="22"/>
+          <w:szCs w:val="28"/>
+        </w:rPr>
         <w:t xml:space="preserve"> </w:t>
       </w:r>
       <w:r>
@@ -283,7 +470,7 @@
           <w:sz w:val="22"/>
           <w:szCs w:val="28"/>
         </w:rPr>
-        <w:t xml:space="preserve">   </w:t>
+        <w:t>|</w:t>
       </w:r>
       <w:r>
         <w:rPr>
@@ -291,7 +478,7 @@
           <w:sz w:val="22"/>
           <w:szCs w:val="28"/>
         </w:rPr>
-        <w:t>|</w:t>
+        <w:t xml:space="preserve"> </w:t>
       </w:r>
       <w:r>
         <w:rPr>
@@ -299,7 +486,7 @@
           <w:sz w:val="22"/>
           <w:szCs w:val="28"/>
         </w:rPr>
-        <w:t xml:space="preserve">   </w:t>
+        <w:t xml:space="preserve">  </w:t>
       </w:r>
       <w:r>
         <w:rPr>
@@ -316,7 +503,79 @@
           <w:sz w:val="22"/>
           <w:szCs w:val="28"/>
         </w:rPr>
-        <w:t>PostgreSQL, Docker, Git/GitHub, Blender, Unreal Engine 5</w:t>
+        <w:t>WSL</w:t>
+      </w:r>
+      <w:r>
+        <w:rPr>
+          <w:color w:val="111111"/>
+          <w:sz w:val="22"/>
+          <w:szCs w:val="28"/>
+        </w:rPr>
+        <w:t>, Docker,</w:t>
+      </w:r>
+      <w:r>
+        <w:rPr>
+          <w:color w:val="111111"/>
+          <w:sz w:val="22"/>
+          <w:szCs w:val="28"/>
+        </w:rPr>
+        <w:t xml:space="preserve"> </w:t>
+      </w:r>
+      <w:r>
+        <w:rPr>
+          <w:color w:val="111111"/>
+          <w:sz w:val="22"/>
+          <w:szCs w:val="28"/>
+        </w:rPr>
+        <w:t>PostgreSQL</w:t>
+      </w:r>
+      <w:r>
+        <w:rPr>
+          <w:color w:val="111111"/>
+          <w:sz w:val="22"/>
+          <w:szCs w:val="28"/>
+        </w:rPr>
+        <w:t>,</w:t>
+      </w:r>
+      <w:r>
+        <w:rPr>
+          <w:color w:val="111111"/>
+          <w:sz w:val="22"/>
+          <w:szCs w:val="28"/>
+        </w:rPr>
+        <w:t xml:space="preserve"> </w:t>
+      </w:r>
+      <w:r>
+        <w:rPr>
+          <w:color w:val="111111"/>
+          <w:sz w:val="22"/>
+          <w:szCs w:val="28"/>
+        </w:rPr>
+        <w:t>Git/</w:t>
+      </w:r>
+      <w:r>
+        <w:rPr>
+          <w:color w:val="111111"/>
+          <w:sz w:val="22"/>
+          <w:szCs w:val="28"/>
+        </w:rPr>
+        <w:t>GitHub, Unreal Engine</w:t>
+      </w:r>
+      <w:r>
+        <w:rPr>
+          <w:color w:val="111111"/>
+          <w:sz w:val="22"/>
+          <w:szCs w:val="28"/>
+        </w:rPr>
+        <w:t xml:space="preserve"> 5</w:t>
+      </w:r>
+      <w:r>
+        <w:rPr>
+          <w:color w:val="111111"/>
+          <w:sz w:val="22"/>
+          <w:szCs w:val="28"/>
+        </w:rPr>
+        <w:t xml:space="preserve"> </w:t>
       </w:r>
     </w:p>
     <w:p>
@@ -446,34 +705,7 @@
           <w:sz w:val="24"/>
           <w:szCs w:val="28"/>
         </w:rPr>
-        <w:t xml:space="preserve">AI Model Generation Team Lead </w:t>
-      </w:r>
-      <w:r>
-        <w:rPr>
-          <w:b/>
-          <w:color w:val="111111"/>
-          <w:sz w:val="24"/>
-          <w:szCs w:val="28"/>
-        </w:rPr>
-        <w:t>–</w:t>
-      </w:r>
-      <w:r>
-        <w:rPr>
-          <w:b/>
-          <w:color w:val="111111"/>
-          <w:sz w:val="24"/>
-          <w:szCs w:val="28"/>
-        </w:rPr>
-        <w:t xml:space="preserve"> Capstone</w:t>
-      </w:r>
-      <w:r>
-        <w:rPr>
-          <w:b/>
-          <w:color w:val="111111"/>
-          <w:sz w:val="24"/>
-          <w:szCs w:val="28"/>
-        </w:rPr>
-        <w:t xml:space="preserve">                                                       </w:t>
+        <w:t xml:space="preserve">Team Lead -  Gulfstream Aerospace Sponsored Senior Capstone                   </w:t>
       </w:r>
       <w:r>
         <w:rPr>
@@ -541,39 +773,155 @@
           <w:sz w:val="22"/>
           <w:szCs w:val="28"/>
         </w:rPr>
-        <w:t xml:space="preserve">• </w:t>
-      </w:r>
-      <w:r>
-        <w:rPr>
-          <w:color w:val="111111"/>
-          <w:sz w:val="22"/>
-          <w:szCs w:val="28"/>
-        </w:rPr>
-        <w:t>Led a 5-person team</w:t>
-      </w:r>
-      <w:r>
-        <w:rPr>
-          <w:color w:val="111111"/>
-          <w:sz w:val="22"/>
-          <w:szCs w:val="28"/>
-        </w:rPr>
-        <w:t xml:space="preserve"> develop</w:t>
-      </w:r>
-      <w:r>
-        <w:rPr>
-          <w:color w:val="111111"/>
-          <w:sz w:val="22"/>
-          <w:szCs w:val="28"/>
-        </w:rPr>
-        <w:t>ing</w:t>
-      </w:r>
-      <w:r>
-        <w:rPr>
-          <w:color w:val="111111"/>
-          <w:sz w:val="22"/>
-          <w:szCs w:val="28"/>
-        </w:rPr>
-        <w:t xml:space="preserve"> an AI-powered 3D asset-generation platform using FastAPI, React, Three.js, Blender, and Unreal Engine 5, translating Gulfstream stakeholder and 3D designer requirements into generation, mesh-processing, visualization, and engine-integration workflows.</w:t>
+        <w:t>•</w:t>
+      </w:r>
+      <w:r>
+        <w:rPr>
+          <w:b/>
+          <w:color w:val="111111"/>
+          <w:sz w:val="22"/>
+          <w:szCs w:val="28"/>
+        </w:rPr>
+        <w:t xml:space="preserve"> </w:t>
+      </w:r>
+      <w:r>
+        <w:rPr>
+          <w:bCs/>
+          <w:color w:val="111111"/>
+          <w:sz w:val="22"/>
+          <w:szCs w:val="28"/>
+        </w:rPr>
+        <w:t>Originated the platform</w:t>
+      </w:r>
+      <w:r>
+        <w:rPr>
+          <w:bCs/>
+          <w:color w:val="111111"/>
+          <w:sz w:val="22"/>
+          <w:szCs w:val="28"/>
+        </w:rPr>
+        <w:t>’</w:t>
+      </w:r>
+      <w:r>
+        <w:rPr>
+          <w:bCs/>
+          <w:color w:val="111111"/>
+          <w:sz w:val="22"/>
+          <w:szCs w:val="28"/>
+        </w:rPr>
+        <w:t xml:space="preserve">s technical approach and </w:t>
+      </w:r>
+      <w:r>
+        <w:rPr>
+          <w:color w:val="111111"/>
+          <w:sz w:val="22"/>
+          <w:szCs w:val="28"/>
+        </w:rPr>
+        <w:t>l</w:t>
+      </w:r>
+      <w:r>
+        <w:rPr>
+          <w:color w:val="111111"/>
+          <w:sz w:val="22"/>
+          <w:szCs w:val="28"/>
+        </w:rPr>
+        <w:t>ed a 5-person team</w:t>
+      </w:r>
+      <w:r>
+        <w:rPr>
+          <w:color w:val="111111"/>
+          <w:sz w:val="22"/>
+          <w:szCs w:val="28"/>
+        </w:rPr>
+        <w:t xml:space="preserve"> </w:t>
+      </w:r>
+      <w:r>
+        <w:rPr>
+          <w:color w:val="111111"/>
+          <w:sz w:val="22"/>
+          <w:szCs w:val="28"/>
+        </w:rPr>
+        <w:t>building</w:t>
+      </w:r>
+      <w:r>
+        <w:rPr>
+          <w:color w:val="111111"/>
+          <w:sz w:val="22"/>
+          <w:szCs w:val="28"/>
+        </w:rPr>
+        <w:t xml:space="preserve"> an AI-</w:t>
+      </w:r>
+      <w:r>
+        <w:rPr>
+          <w:color w:val="111111"/>
+          <w:sz w:val="22"/>
+          <w:szCs w:val="28"/>
+        </w:rPr>
+        <w:t>assisted</w:t>
+      </w:r>
+      <w:r>
+        <w:rPr>
+          <w:color w:val="111111"/>
+          <w:sz w:val="22"/>
+          <w:szCs w:val="28"/>
+        </w:rPr>
+        <w:t xml:space="preserve"> 3D asset-generation platform </w:t>
+      </w:r>
+      <w:r>
+        <w:rPr>
+          <w:color w:val="111111"/>
+          <w:sz w:val="22"/>
+          <w:szCs w:val="28"/>
+        </w:rPr>
+        <w:t>with</w:t>
+      </w:r>
+      <w:r>
+        <w:rPr>
+          <w:color w:val="111111"/>
+          <w:sz w:val="22"/>
+          <w:szCs w:val="28"/>
+        </w:rPr>
+        <w:t xml:space="preserve"> FastAPI, React, Three.js, Blender, and Unreal Engine 5, translating Gulfstream stakeholder requirements into generation,</w:t>
+      </w:r>
+      <w:r>
+        <w:rPr>
+          <w:color w:val="111111"/>
+          <w:sz w:val="22"/>
+          <w:szCs w:val="28"/>
+        </w:rPr>
+        <w:t xml:space="preserve"> </w:t>
+      </w:r>
+      <w:r>
+        <w:rPr>
+          <w:color w:val="111111"/>
+          <w:sz w:val="22"/>
+          <w:szCs w:val="28"/>
+        </w:rPr>
+        <w:t>mesh-</w:t>
+      </w:r>
+      <w:r>
+        <w:rPr>
+          <w:color w:val="111111"/>
+          <w:sz w:val="22"/>
+          <w:szCs w:val="28"/>
+        </w:rPr>
+        <w:t xml:space="preserve">processing, </w:t>
+      </w:r>
+      <w:r>
+        <w:rPr>
+          <w:color w:val="111111"/>
+          <w:sz w:val="22"/>
+          <w:szCs w:val="28"/>
+        </w:rPr>
+        <w:t>inspection</w:t>
+      </w:r>
+      <w:r>
+        <w:rPr>
+          <w:color w:val="111111"/>
+          <w:sz w:val="22"/>
+          <w:szCs w:val="28"/>
+        </w:rPr>
+        <w:t>, and engine-integration workflows.</w:t>
       </w:r>
     </w:p>
     <w:p>
@@ -610,7 +958,15 @@
           <w:sz w:val="22"/>
           <w:szCs w:val="28"/>
         </w:rPr>
-        <w:t>Integrated TRELLIS, TripoSR, and</w:t>
+        <w:t>Integrated</w:t>
+      </w:r>
+      <w:r>
+        <w:rPr>
+          <w:color w:val="111111"/>
+          <w:sz w:val="22"/>
+          <w:szCs w:val="28"/>
+        </w:rPr>
+        <w:t xml:space="preserve"> TRELLIS, TripoSR, and</w:t>
       </w:r>
       <w:r>
         <w:rPr>
@@ -626,7 +982,31 @@
           <w:sz w:val="22"/>
           <w:szCs w:val="28"/>
         </w:rPr>
-        <w:t>ModelsLab across local and cloud text-to-3D/image-to-3D workflows, reducing successful initial 3D draft generation from multi-hour manual workflows to under 5 minutes.</w:t>
+        <w:t>ModelsLab across local and cloud text-to-3D</w:t>
+      </w:r>
+      <w:r>
+        <w:rPr>
+          <w:color w:val="111111"/>
+          <w:sz w:val="22"/>
+          <w:szCs w:val="28"/>
+        </w:rPr>
+        <w:t xml:space="preserve"> and </w:t>
+      </w:r>
+      <w:r>
+        <w:rPr>
+          <w:color w:val="111111"/>
+          <w:sz w:val="22"/>
+          <w:szCs w:val="28"/>
+        </w:rPr>
+        <w:t xml:space="preserve">image-to-3D workflows, reducing </w:t>
+      </w:r>
+      <w:r>
+        <w:rPr>
+          <w:color w:val="111111"/>
+          <w:sz w:val="22"/>
+          <w:szCs w:val="28"/>
+        </w:rPr>
+        <w:t xml:space="preserve">time to a successful initial draft from multiple hours to under five minutes. </w:t>
       </w:r>
     </w:p>
     <w:p>
@@ -663,39 +1043,15 @@
           <w:sz w:val="22"/>
           <w:szCs w:val="28"/>
         </w:rPr>
-        <w:t>Designed</w:t>
-      </w:r>
-      <w:r>
-        <w:rPr>
-          <w:color w:val="111111"/>
-          <w:sz w:val="22"/>
-          <w:szCs w:val="28"/>
-        </w:rPr>
-        <w:t xml:space="preserve"> Blender normalization, glTF 2.0 </w:t>
-      </w:r>
-      <w:r>
-        <w:rPr>
-          <w:color w:val="111111"/>
-          <w:sz w:val="22"/>
-          <w:szCs w:val="28"/>
-        </w:rPr>
-        <w:t xml:space="preserve">compatibility </w:t>
-      </w:r>
-      <w:r>
-        <w:rPr>
-          <w:color w:val="111111"/>
-          <w:sz w:val="22"/>
-          <w:szCs w:val="28"/>
-        </w:rPr>
-        <w:t>handling, interactive mesh inspection, and Unreal Engine</w:t>
-      </w:r>
-      <w:r>
-        <w:rPr>
-          <w:color w:val="111111"/>
-          <w:sz w:val="22"/>
-          <w:szCs w:val="28"/>
-        </w:rPr>
-        <w:t xml:space="preserve"> 5</w:t>
+        <w:t>Streamlined 3D asset workflows by implementing Blender normalization tools</w:t>
+      </w:r>
+      <w:r>
+        <w:rPr>
+          <w:color w:val="111111"/>
+          <w:sz w:val="22"/>
+          <w:szCs w:val="28"/>
+        </w:rPr>
+        <w:t>,</w:t>
       </w:r>
       <w:r>
         <w:rPr>
@@ -711,7 +1067,7 @@
           <w:sz w:val="22"/>
           <w:szCs w:val="28"/>
         </w:rPr>
-        <w:t>integration for grounding,</w:t>
+        <w:t>glTF 2.0</w:t>
       </w:r>
       <w:r>
         <w:rPr>
@@ -727,31 +1083,111 @@
           <w:sz w:val="22"/>
           <w:szCs w:val="28"/>
         </w:rPr>
-        <w:t>scale/orientation correction,</w:t>
-      </w:r>
-      <w:r>
-        <w:rPr>
-          <w:color w:val="111111"/>
-          <w:sz w:val="22"/>
-          <w:szCs w:val="28"/>
-        </w:rPr>
-        <w:t xml:space="preserve"> materials,</w:t>
-      </w:r>
-      <w:r>
-        <w:rPr>
-          <w:color w:val="111111"/>
-          <w:sz w:val="22"/>
-          <w:szCs w:val="28"/>
-        </w:rPr>
-        <w:t xml:space="preserve"> metadata validation</w:t>
-      </w:r>
-      <w:r>
-        <w:rPr>
-          <w:color w:val="111111"/>
-          <w:sz w:val="22"/>
-          <w:szCs w:val="28"/>
-        </w:rPr>
-        <w:t xml:space="preserve"> for exporting.</w:t>
+        <w:t>compatibility checks</w:t>
+      </w:r>
+      <w:r>
+        <w:rPr>
+          <w:color w:val="111111"/>
+          <w:sz w:val="22"/>
+          <w:szCs w:val="28"/>
+        </w:rPr>
+        <w:t>,</w:t>
+      </w:r>
+      <w:r>
+        <w:rPr>
+          <w:color w:val="111111"/>
+          <w:sz w:val="22"/>
+          <w:szCs w:val="28"/>
+        </w:rPr>
+        <w:t xml:space="preserve"> and</w:t>
+      </w:r>
+      <w:r>
+        <w:rPr>
+          <w:color w:val="111111"/>
+          <w:sz w:val="22"/>
+          <w:szCs w:val="28"/>
+        </w:rPr>
+        <w:t xml:space="preserve"> </w:t>
+      </w:r>
+      <w:r>
+        <w:rPr>
+          <w:color w:val="111111"/>
+          <w:sz w:val="22"/>
+          <w:szCs w:val="28"/>
+        </w:rPr>
+        <w:t xml:space="preserve">React-based </w:t>
+      </w:r>
+      <w:r>
+        <w:rPr>
+          <w:color w:val="111111"/>
+          <w:sz w:val="22"/>
+          <w:szCs w:val="28"/>
+        </w:rPr>
+        <w:t>dynamic mesh handlin</w:t>
+      </w:r>
+      <w:r>
+        <w:rPr>
+          <w:color w:val="111111"/>
+          <w:sz w:val="22"/>
+          <w:szCs w:val="28"/>
+        </w:rPr>
+        <w:t>g export t</w:t>
+      </w:r>
+      <w:r>
+        <w:rPr>
+          <w:color w:val="111111"/>
+          <w:sz w:val="22"/>
+          <w:szCs w:val="28"/>
+        </w:rPr>
+        <w:t>o</w:t>
+      </w:r>
+      <w:r>
+        <w:rPr>
+          <w:color w:val="111111"/>
+          <w:sz w:val="22"/>
+          <w:szCs w:val="28"/>
+        </w:rPr>
+        <w:t xml:space="preserve"> </w:t>
+      </w:r>
+      <w:r>
+        <w:rPr>
+          <w:color w:val="111111"/>
+          <w:sz w:val="22"/>
+          <w:szCs w:val="28"/>
+        </w:rPr>
+        <w:t>Unrea</w:t>
+      </w:r>
+      <w:r>
+        <w:rPr>
+          <w:color w:val="111111"/>
+          <w:sz w:val="22"/>
+          <w:szCs w:val="28"/>
+        </w:rPr>
+        <w:t>l Engine</w:t>
+      </w:r>
+      <w:r>
+        <w:rPr>
+          <w:color w:val="111111"/>
+          <w:sz w:val="22"/>
+          <w:szCs w:val="28"/>
+        </w:rPr>
+        <w:t xml:space="preserve"> through the Web</w:t>
+      </w:r>
+      <w:r>
+        <w:rPr>
+          <w:color w:val="111111"/>
+          <w:sz w:val="22"/>
+          <w:szCs w:val="28"/>
+        </w:rPr>
+        <w:t xml:space="preserve"> Remote Control API</w:t>
+      </w:r>
+      <w:r>
+        <w:rPr>
+          <w:color w:val="111111"/>
+          <w:sz w:val="22"/>
+          <w:szCs w:val="28"/>
+        </w:rPr>
+        <w:t>.</w:t>
       </w:r>
     </w:p>
     <w:p>
@@ -891,7 +1327,16 @@
           <w:sz w:val="22"/>
           <w:szCs w:val="28"/>
         </w:rPr>
-        <w:t xml:space="preserve">• </w:t>
+        <w:t>•</w:t>
+      </w:r>
+      <w:r>
+        <w:rPr>
+          <w:b/>
+          <w:color w:val="111111"/>
+          <w:sz w:val="22"/>
+          <w:szCs w:val="28"/>
+        </w:rPr>
+        <w:t xml:space="preserve"> </w:t>
       </w:r>
       <w:r>
         <w:rPr>
@@ -917,8 +1362,7 @@
       <w:r>
         <w:rPr>
           <w:b/>
-          <w:color w:val="333333"/>
-          <w:sz w:val="24"/>
+          <w:sz w:val="22"/>
           <w:szCs w:val="28"/>
         </w:rPr>
         <w:t>PROJECTS</w:t>
@@ -938,15 +1382,41 @@
           <w:szCs w:val="28"/>
         </w:rPr>
       </w:pPr>
-      <w:r>
-        <w:rPr>
-          <w:b/>
-          <w:color w:val="111111"/>
-          <w:sz w:val="24"/>
-          <w:szCs w:val="28"/>
-        </w:rPr>
-        <w:t>Trainline</w:t>
-      </w:r>
+      <w:hyperlink r:id="rId10" w:history="1">
+        <w:r>
+          <w:rPr>
+            <w:rStyle w:val="Hyperlink"/>
+            <w:b/>
+            <w:color w:val="000000" w:themeColor="text1"/>
+            <w:sz w:val="24"/>
+            <w:szCs w:val="28"/>
+            <w:u w:val="none"/>
+          </w:rPr>
+          <w:t>Trai</w:t>
+        </w:r>
+        <w:r>
+          <w:rPr>
+            <w:rStyle w:val="Hyperlink"/>
+            <w:b/>
+            <w:color w:val="000000" w:themeColor="text1"/>
+            <w:sz w:val="24"/>
+            <w:szCs w:val="28"/>
+            <w:u w:val="none"/>
+          </w:rPr>
+          <w:t>n</w:t>
+        </w:r>
+        <w:r>
+          <w:rPr>
+            <w:rStyle w:val="Hyperlink"/>
+            <w:b/>
+            <w:color w:val="000000" w:themeColor="text1"/>
+            <w:sz w:val="24"/>
+            <w:szCs w:val="28"/>
+            <w:u w:val="none"/>
+          </w:rPr>
+          <w:t>line</w:t>
+        </w:r>
+      </w:hyperlink>
       <w:r>
         <w:rPr>
           <w:color w:val="111111"/>
@@ -988,6 +1458,7 @@
         <w:spacing w:before="4" w:after="6" w:line="247" w:lineRule="auto"/>
         <w:ind w:left="187" w:hanging="187"/>
         <w:rPr>
+          <w:color w:val="111111"/>
           <w:sz w:val="22"/>
           <w:szCs w:val="28"/>
         </w:rPr>
@@ -999,23 +1470,58 @@
           <w:sz w:val="22"/>
           <w:szCs w:val="28"/>
         </w:rPr>
-        <w:t xml:space="preserve">• </w:t>
-      </w:r>
-      <w:r>
-        <w:rPr>
-          <w:color w:val="111111"/>
-          <w:sz w:val="22"/>
-          <w:szCs w:val="28"/>
-        </w:rPr>
-        <w:t>Designed and containerized a full-stack train-booking platform supporting seven end-to-end workflows</w:t>
-      </w:r>
-      <w:r>
-        <w:rPr>
-          <w:color w:val="111111"/>
-          <w:sz w:val="22"/>
-          <w:szCs w:val="28"/>
-        </w:rPr>
-        <w:t>.</w:t>
+        <w:t>•</w:t>
+      </w:r>
+      <w:r>
+        <w:rPr>
+          <w:b/>
+          <w:color w:val="111111"/>
+          <w:sz w:val="22"/>
+          <w:szCs w:val="28"/>
+        </w:rPr>
+        <w:t xml:space="preserve"> </w:t>
+      </w:r>
+      <w:r>
+        <w:rPr>
+          <w:bCs/>
+          <w:color w:val="111111"/>
+          <w:sz w:val="22"/>
+          <w:szCs w:val="28"/>
+        </w:rPr>
+        <w:t>Built</w:t>
+      </w:r>
+      <w:r>
+        <w:rPr>
+          <w:bCs/>
+          <w:color w:val="111111"/>
+          <w:sz w:val="22"/>
+          <w:szCs w:val="28"/>
+        </w:rPr>
+        <w:t xml:space="preserve"> and c</w:t>
+      </w:r>
+      <w:r>
+        <w:rPr>
+          <w:color w:val="111111"/>
+          <w:sz w:val="22"/>
+          <w:szCs w:val="28"/>
+        </w:rPr>
+        <w:t>ontainerized a full-stack train</w:t>
+      </w:r>
+      <w:r>
+        <w:rPr>
+          <w:color w:val="111111"/>
+          <w:sz w:val="22"/>
+          <w:szCs w:val="28"/>
+        </w:rPr>
+        <w:t>-</w:t>
+      </w:r>
+      <w:r>
+        <w:rPr>
+          <w:color w:val="111111"/>
+          <w:sz w:val="22"/>
+          <w:szCs w:val="28"/>
+        </w:rPr>
+        <w:t>booking platform covering authentication, trip discovery, guarded seat selection, booking, payment validation, tickets, and notifications.</w:t>
       </w:r>
     </w:p>
     <w:p>
@@ -1023,6 +1529,8 @@
         <w:spacing w:before="4" w:after="6" w:line="247" w:lineRule="auto"/>
         <w:ind w:left="187" w:hanging="187"/>
         <w:rPr>
+          <w:bCs/>
+          <w:color w:val="111111"/>
           <w:sz w:val="22"/>
           <w:szCs w:val="28"/>
         </w:rPr>
@@ -1034,31 +1542,99 @@
           <w:sz w:val="22"/>
           <w:szCs w:val="28"/>
         </w:rPr>
+        <w:t>•</w:t>
+      </w:r>
+      <w:r>
+        <w:rPr>
+          <w:bCs/>
+          <w:color w:val="111111"/>
+          <w:sz w:val="22"/>
+          <w:szCs w:val="28"/>
+        </w:rPr>
+        <w:t xml:space="preserve"> Protected booking integrity with server-authoritative fares, ownership-based authorization, PostgreSQL transactions and row locking, and a conditional uniqueness constraint preventing conflicting active seat reservations. </w:t>
+      </w:r>
+    </w:p>
+    <w:p>
+      <w:pPr>
+        <w:spacing w:before="4" w:after="6" w:line="247" w:lineRule="auto"/>
+        <w:ind w:left="187" w:hanging="187"/>
+        <w:rPr>
+          <w:color w:val="111111"/>
+          <w:sz w:val="22"/>
+          <w:szCs w:val="28"/>
+        </w:rPr>
+      </w:pPr>
+      <w:r>
+        <w:rPr>
+          <w:b/>
+          <w:color w:val="111111"/>
+          <w:sz w:val="22"/>
+          <w:szCs w:val="28"/>
+        </w:rPr>
         <w:t xml:space="preserve">• </w:t>
       </w:r>
       <w:r>
         <w:rPr>
-          <w:color w:val="111111"/>
-          <w:sz w:val="22"/>
-          <w:szCs w:val="28"/>
-        </w:rPr>
-        <w:t xml:space="preserve">Built RESTful CRUD APIs and relational data models; </w:t>
-      </w:r>
-      <w:r>
-        <w:rPr>
-          <w:color w:val="111111"/>
-          <w:sz w:val="22"/>
-          <w:szCs w:val="28"/>
-        </w:rPr>
-        <w:t>hardened</w:t>
-      </w:r>
-      <w:r>
-        <w:rPr>
-          <w:color w:val="111111"/>
-          <w:sz w:val="22"/>
-          <w:szCs w:val="28"/>
-        </w:rPr>
-        <w:t xml:space="preserve"> deployment with authorization, input validation, secret management, security headers, and Docker configuration.</w:t>
+          <w:bCs/>
+          <w:color w:val="111111"/>
+          <w:sz w:val="22"/>
+          <w:szCs w:val="28"/>
+        </w:rPr>
+        <w:t>Established reproducible Docker Compose</w:t>
+      </w:r>
+      <w:r>
+        <w:rPr>
+          <w:bCs/>
+          <w:color w:val="111111"/>
+          <w:sz w:val="22"/>
+          <w:szCs w:val="28"/>
+        </w:rPr>
+        <w:t xml:space="preserve"> environments, health</w:t>
+      </w:r>
+      <w:r>
+        <w:rPr>
+          <w:bCs/>
+          <w:color w:val="111111"/>
+          <w:sz w:val="22"/>
+          <w:szCs w:val="28"/>
+        </w:rPr>
+        <w:t xml:space="preserve"> and </w:t>
+      </w:r>
+      <w:r>
+        <w:rPr>
+          <w:bCs/>
+          <w:color w:val="111111"/>
+          <w:sz w:val="22"/>
+          <w:szCs w:val="28"/>
+        </w:rPr>
+        <w:t xml:space="preserve">readiness probes, demo-data seeding, and GitHub Actions </w:t>
+      </w:r>
+      <w:r>
+        <w:rPr>
+          <w:bCs/>
+          <w:color w:val="111111"/>
+          <w:sz w:val="22"/>
+          <w:szCs w:val="28"/>
+        </w:rPr>
+        <w:t>CI</w:t>
+      </w:r>
+      <w:r>
+        <w:rPr>
+          <w:bCs/>
+          <w:color w:val="111111"/>
+          <w:sz w:val="22"/>
+          <w:szCs w:val="28"/>
+        </w:rPr>
+        <w:t>; a</w:t>
+      </w:r>
+      <w:r>
+        <w:rPr>
+          <w:bCs/>
+          <w:color w:val="111111"/>
+          <w:sz w:val="22"/>
+          <w:szCs w:val="28"/>
+        </w:rPr>
+        <w:t xml:space="preserve">dded 52 fast backend tests and 2 PostgreSQL integration tests with 94.6% measured branch coverage and a 90% gate. </w:t>
       </w:r>
     </w:p>
     <w:p>
@@ -1073,22 +1649,66 @@
           <w:szCs w:val="28"/>
         </w:rPr>
       </w:pPr>
-      <w:r>
-        <w:rPr>
-          <w:b/>
-          <w:color w:val="111111"/>
-          <w:sz w:val="24"/>
-          <w:szCs w:val="28"/>
-        </w:rPr>
-        <w:t>meeting-to-tasks</w:t>
-      </w:r>
-      <w:r>
-        <w:rPr>
-          <w:color w:val="111111"/>
-          <w:sz w:val="22"/>
-          <w:szCs w:val="28"/>
-        </w:rPr>
-        <w:t xml:space="preserve"> | FastAPI, FAISS, Ollama, GitHub REST API</w:t>
+      <w:hyperlink r:id="rId11" w:history="1">
+        <w:r>
+          <w:rPr>
+            <w:rStyle w:val="Hyperlink"/>
+            <w:b/>
+            <w:color w:val="auto"/>
+            <w:sz w:val="24"/>
+            <w:szCs w:val="28"/>
+            <w:u w:val="none"/>
+          </w:rPr>
+          <w:t>meeting-to-t</w:t>
+        </w:r>
+        <w:r>
+          <w:rPr>
+            <w:rStyle w:val="Hyperlink"/>
+            <w:b/>
+            <w:color w:val="auto"/>
+            <w:sz w:val="24"/>
+            <w:szCs w:val="28"/>
+            <w:u w:val="none"/>
+          </w:rPr>
+          <w:t>a</w:t>
+        </w:r>
+        <w:r>
+          <w:rPr>
+            <w:rStyle w:val="Hyperlink"/>
+            <w:b/>
+            <w:color w:val="auto"/>
+            <w:sz w:val="24"/>
+            <w:szCs w:val="28"/>
+            <w:u w:val="none"/>
+          </w:rPr>
+          <w:t>sks</w:t>
+        </w:r>
+      </w:hyperlink>
+      <w:r>
+        <w:rPr>
+          <w:color w:val="111111"/>
+          <w:sz w:val="22"/>
+          <w:szCs w:val="28"/>
+        </w:rPr>
+        <w:t xml:space="preserve"> | </w:t>
+      </w:r>
+      <w:proofErr w:type="spellStart"/>
+      <w:r>
+        <w:rPr>
+          <w:color w:val="111111"/>
+          <w:sz w:val="22"/>
+          <w:szCs w:val="28"/>
+        </w:rPr>
+        <w:t>FastAPI</w:t>
+      </w:r>
+      <w:proofErr w:type="spellEnd"/>
+      <w:r>
+        <w:rPr>
+          <w:color w:val="111111"/>
+          <w:sz w:val="22"/>
+          <w:szCs w:val="28"/>
+        </w:rPr>
+        <w:t>, FAISS, Ollama, GitHub REST API</w:t>
       </w:r>
       <w:r>
         <w:rPr>
@@ -1135,15 +1755,104 @@
           <w:sz w:val="22"/>
           <w:szCs w:val="28"/>
         </w:rPr>
-        <w:t xml:space="preserve">• </w:t>
-      </w:r>
-      <w:r>
-        <w:rPr>
-          <w:color w:val="111111"/>
-          <w:sz w:val="22"/>
-          <w:szCs w:val="28"/>
-        </w:rPr>
-        <w:t xml:space="preserve">Built a local-first meeting intelligence application that indexes transcripts into source-grounded, reviewable task drafts and optionally publishes approved issues to GitHub. </w:t>
+        <w:t>•</w:t>
+      </w:r>
+      <w:r>
+        <w:rPr>
+          <w:b/>
+          <w:color w:val="111111"/>
+          <w:sz w:val="22"/>
+          <w:szCs w:val="28"/>
+        </w:rPr>
+        <w:t xml:space="preserve"> </w:t>
+      </w:r>
+      <w:r>
+        <w:rPr>
+          <w:color w:val="111111"/>
+          <w:sz w:val="22"/>
+          <w:szCs w:val="28"/>
+        </w:rPr>
+        <w:t xml:space="preserve">Built a local-first meeting intelligence application that </w:t>
+      </w:r>
+      <w:r>
+        <w:rPr>
+          <w:color w:val="111111"/>
+          <w:sz w:val="22"/>
+          <w:szCs w:val="28"/>
+        </w:rPr>
+        <w:t xml:space="preserve">converts </w:t>
+      </w:r>
+      <w:r>
+        <w:rPr>
+          <w:color w:val="111111"/>
+          <w:sz w:val="22"/>
+          <w:szCs w:val="28"/>
+        </w:rPr>
+        <w:t>transcripts into source-grounded, reviewable task drafts and publishes</w:t>
+      </w:r>
+      <w:r>
+        <w:rPr>
+          <w:color w:val="111111"/>
+          <w:sz w:val="22"/>
+          <w:szCs w:val="28"/>
+        </w:rPr>
+        <w:t xml:space="preserve"> </w:t>
+      </w:r>
+      <w:r>
+        <w:rPr>
+          <w:color w:val="111111"/>
+          <w:sz w:val="22"/>
+          <w:szCs w:val="28"/>
+        </w:rPr>
+        <w:t xml:space="preserve">approved </w:t>
+      </w:r>
+      <w:r>
+        <w:rPr>
+          <w:color w:val="111111"/>
+          <w:sz w:val="22"/>
+          <w:szCs w:val="28"/>
+        </w:rPr>
+        <w:t xml:space="preserve">action </w:t>
+      </w:r>
+      <w:r>
+        <w:rPr>
+          <w:color w:val="111111"/>
+          <w:sz w:val="22"/>
+          <w:szCs w:val="28"/>
+        </w:rPr>
+        <w:t>items as</w:t>
+      </w:r>
+      <w:r>
+        <w:rPr>
+          <w:color w:val="111111"/>
+          <w:sz w:val="22"/>
+          <w:szCs w:val="28"/>
+        </w:rPr>
+        <w:t xml:space="preserve"> </w:t>
+      </w:r>
+      <w:r>
+        <w:rPr>
+          <w:color w:val="111111"/>
+          <w:sz w:val="22"/>
+          <w:szCs w:val="28"/>
+        </w:rPr>
+        <w:t xml:space="preserve">GitHub </w:t>
+      </w:r>
+      <w:r>
+        <w:rPr>
+          <w:color w:val="111111"/>
+          <w:sz w:val="22"/>
+          <w:szCs w:val="28"/>
+        </w:rPr>
+        <w:t>issues</w:t>
+      </w:r>
+      <w:r>
+        <w:rPr>
+          <w:color w:val="111111"/>
+          <w:sz w:val="22"/>
+          <w:szCs w:val="28"/>
+        </w:rPr>
+        <w:t xml:space="preserve">. </w:t>
       </w:r>
     </w:p>
     <w:p>
@@ -1212,7 +1921,25 @@
           <w:sz w:val="22"/>
           <w:szCs w:val="28"/>
         </w:rPr>
-        <w:t>using Sentence Transformers, FAISS, local Phi-3 Mini inference via Ollama, SQLite persistence, and GitHub</w:t>
+        <w:t xml:space="preserve">using Sentence Transformers, FAISS, </w:t>
+      </w:r>
+      <w:proofErr w:type="spellStart"/>
+      <w:r>
+        <w:rPr>
+          <w:color w:val="111111"/>
+          <w:sz w:val="22"/>
+          <w:szCs w:val="28"/>
+        </w:rPr>
+        <w:t>Ollama</w:t>
+      </w:r>
+      <w:proofErr w:type="spellEnd"/>
+      <w:r>
+        <w:rPr>
+          <w:color w:val="111111"/>
+          <w:sz w:val="22"/>
+          <w:szCs w:val="28"/>
+        </w:rPr>
+        <w:t>, SQLite persistence, and GitHub</w:t>
       </w:r>
       <w:r>
         <w:rPr>
@@ -1229,105 +1956,6 @@
           <w:szCs w:val="28"/>
         </w:rPr>
         <w:t>.</w:t>
-      </w:r>
-    </w:p>
-    <w:p>
-      <w:pPr>
-        <w:spacing w:before="4" w:after="6" w:line="247" w:lineRule="auto"/>
-        <w:ind w:left="187" w:hanging="187"/>
-        <w:rPr>
-          <w:sz w:val="22"/>
-          <w:szCs w:val="28"/>
-        </w:rPr>
-      </w:pPr>
-      <w:r>
-        <w:rPr>
-          <w:b/>
-          <w:color w:val="111111"/>
-          <w:sz w:val="24"/>
-          <w:szCs w:val="28"/>
-        </w:rPr>
-        <w:t>Flight Booking Web App</w:t>
-      </w:r>
-      <w:r>
-        <w:rPr>
-          <w:color w:val="111111"/>
-          <w:sz w:val="22"/>
-          <w:szCs w:val="28"/>
-        </w:rPr>
-        <w:t xml:space="preserve"> | Spring Boot, PostgreSQL, HTML/CSS</w:t>
-      </w:r>
-      <w:r>
-        <w:rPr>
-          <w:b/>
-          <w:color w:val="111111"/>
-          <w:sz w:val="22"/>
-          <w:szCs w:val="28"/>
-        </w:rPr>
-        <w:tab/>
-      </w:r>
-      <w:r>
-        <w:rPr>
-          <w:b/>
-          <w:color w:val="111111"/>
-          <w:sz w:val="22"/>
-          <w:szCs w:val="28"/>
-        </w:rPr>
-        <w:t xml:space="preserve">                                    </w:t>
-      </w:r>
-      <w:r>
-        <w:rPr>
-          <w:b/>
-          <w:color w:val="111111"/>
-          <w:sz w:val="22"/>
-          <w:szCs w:val="28"/>
-        </w:rPr>
-        <w:t xml:space="preserve">      </w:t>
-      </w:r>
-      <w:r>
-        <w:rPr>
-          <w:b/>
-          <w:color w:val="111111"/>
-          <w:sz w:val="22"/>
-          <w:szCs w:val="28"/>
-        </w:rPr>
-        <w:t>Aug</w:t>
-      </w:r>
-      <w:r>
-        <w:rPr>
-          <w:b/>
-          <w:color w:val="111111"/>
-          <w:sz w:val="22"/>
-          <w:szCs w:val="28"/>
-        </w:rPr>
-        <w:t xml:space="preserve"> 2024</w:t>
-      </w:r>
-    </w:p>
-    <w:p>
-      <w:pPr>
-        <w:spacing w:before="4" w:after="6" w:line="247" w:lineRule="auto"/>
-        <w:ind w:left="187" w:hanging="187"/>
-        <w:rPr>
-          <w:sz w:val="22"/>
-          <w:szCs w:val="28"/>
-        </w:rPr>
-      </w:pPr>
-      <w:r>
-        <w:rPr>
-          <w:b/>
-          <w:color w:val="111111"/>
-          <w:sz w:val="22"/>
-          <w:szCs w:val="28"/>
-        </w:rPr>
-        <w:t xml:space="preserve">• </w:t>
-      </w:r>
-      <w:r>
-        <w:rPr>
-          <w:color w:val="111111"/>
-          <w:sz w:val="22"/>
-          <w:szCs w:val="28"/>
-        </w:rPr>
-        <w:t>Built a Spring Boot booking application backed by a normalized PostgreSQL schema for users, flights, seats, bookings, and authentication, enforcing relational integrity with primary and foreign-key constraints.</w:t>
       </w:r>
     </w:p>
     <w:p>
@@ -1448,7 +2076,16 @@
           <w:sz w:val="22"/>
           <w:szCs w:val="28"/>
         </w:rPr>
-        <w:t xml:space="preserve">• </w:t>
+        <w:t>•</w:t>
+      </w:r>
+      <w:r>
+        <w:rPr>
+          <w:b/>
+          <w:color w:val="111111"/>
+          <w:sz w:val="22"/>
+          <w:szCs w:val="28"/>
+        </w:rPr>
+        <w:t xml:space="preserve"> </w:t>
       </w:r>
       <w:r>
         <w:rPr>
@@ -1509,7 +2146,39 @@
           <w:sz w:val="22"/>
           <w:szCs w:val="28"/>
         </w:rPr>
-        <w:t>Represented ACM at organization fairs and the Technical Day Career Showcase, demonstrating a QR scavenger hunt and ACM web projects while engaging prospective members and industry professionals.</w:t>
+        <w:t>Represented ACM at organization fair</w:t>
+      </w:r>
+      <w:r>
+        <w:rPr>
+          <w:color w:val="111111"/>
+          <w:sz w:val="22"/>
+          <w:szCs w:val="28"/>
+        </w:rPr>
+        <w:t>s, hackathons</w:t>
+      </w:r>
+      <w:r>
+        <w:rPr>
+          <w:color w:val="111111"/>
+          <w:sz w:val="22"/>
+          <w:szCs w:val="28"/>
+        </w:rPr>
+        <w:t>,</w:t>
+      </w:r>
+      <w:r>
+        <w:rPr>
+          <w:color w:val="111111"/>
+          <w:sz w:val="22"/>
+          <w:szCs w:val="28"/>
+        </w:rPr>
+        <w:t xml:space="preserve"> Career Showcase Week, </w:t>
+      </w:r>
+      <w:r>
+        <w:rPr>
+          <w:color w:val="111111"/>
+          <w:sz w:val="22"/>
+          <w:szCs w:val="28"/>
+        </w:rPr>
+        <w:t xml:space="preserve">demonstrating a QR scavenger hunt and chapter web projects to prospective members and industry professionals. </w:t>
       </w:r>
     </w:p>
     <w:sectPr>
@@ -2114,7 +2783,7 @@
   <w:style w:type="paragraph" w:default="1" w:styleId="Normal">
     <w:name w:val="Normal"/>
     <w:qFormat/>
-    <w:rsid w:val="00FC693F"/>
+    <w:rsid w:val="002E2FDB"/>
     <w:pPr>
       <w:spacing w:after="0" w:line="240" w:lineRule="auto"/>
     </w:pPr>
@@ -2335,7 +3004,6 @@
   <w:style w:type="character" w:default="1" w:styleId="DefaultParagraphFont">
     <w:name w:val="Default Paragraph Font"/>
     <w:uiPriority w:val="1"/>
-    <w:semiHidden/>
     <w:unhideWhenUsed/>
   </w:style>
   <w:style w:type="table" w:default="1" w:styleId="TableNormal">
@@ -13106,6 +13774,41 @@
         <w:shd w:val="clear" w:color="auto" w:fill="FBCAA2" w:themeFill="accent6" w:themeFillTint="7F"/>
       </w:tcPr>
     </w:tblStylePr>
+  </w:style>
+  <w:style w:type="character" w:styleId="Hyperlink">
+    <w:name w:val="Hyperlink"/>
+    <w:basedOn w:val="DefaultParagraphFont"/>
+    <w:uiPriority w:val="99"/>
+    <w:unhideWhenUsed/>
+    <w:rsid w:val="00652F10"/>
+    <w:rPr>
+      <w:color w:val="0000FF" w:themeColor="hyperlink"/>
+      <w:u w:val="single"/>
+    </w:rPr>
+  </w:style>
+  <w:style w:type="character" w:styleId="UnresolvedMention">
+    <w:name w:val="Unresolved Mention"/>
+    <w:basedOn w:val="DefaultParagraphFont"/>
+    <w:uiPriority w:val="99"/>
+    <w:semiHidden/>
+    <w:unhideWhenUsed/>
+    <w:rsid w:val="007748E7"/>
+    <w:rPr>
+      <w:color w:val="605E5C"/>
+      <w:shd w:val="clear" w:color="auto" w:fill="E1DFDD"/>
+    </w:rPr>
+  </w:style>
+  <w:style w:type="character" w:styleId="FollowedHyperlink">
+    <w:name w:val="FollowedHyperlink"/>
+    <w:basedOn w:val="DefaultParagraphFont"/>
+    <w:uiPriority w:val="99"/>
+    <w:semiHidden/>
+    <w:unhideWhenUsed/>
+    <w:rsid w:val="007748E7"/>
+    <w:rPr>
+      <w:color w:val="800080" w:themeColor="followedHyperlink"/>
+      <w:u w:val="single"/>
+    </w:rPr>
   </w:style>
 </w:styles>
 </file>

</xml_diff>

<commit_message>
updated bullet points for resume
</commit_message>
<xml_diff>
--- a/images/Hamza_Salahuddin_Resume.docx
+++ b/images/Hamza_Salahuddin_Resume.docx
@@ -43,27 +43,7 @@
             <w:szCs w:val="28"/>
             <w:u w:val="none"/>
           </w:rPr>
-          <w:t>mazeadone</w:t>
-        </w:r>
-        <w:r>
-          <w:rPr>
-            <w:rStyle w:val="Hyperlink"/>
-            <w:color w:val="000000" w:themeColor="text1"/>
-            <w:sz w:val="22"/>
-            <w:szCs w:val="28"/>
-            <w:u w:val="none"/>
-          </w:rPr>
-          <w:t>@</w:t>
-        </w:r>
-        <w:r>
-          <w:rPr>
-            <w:rStyle w:val="Hyperlink"/>
-            <w:color w:val="000000" w:themeColor="text1"/>
-            <w:sz w:val="22"/>
-            <w:szCs w:val="28"/>
-            <w:u w:val="none"/>
-          </w:rPr>
-          <w:t>gmail.com</w:t>
+          <w:t>mazeadone@gmail.com</w:t>
         </w:r>
       </w:hyperlink>
     </w:p>
@@ -83,25 +63,7 @@
             <w:sz w:val="22"/>
             <w:u w:val="none"/>
           </w:rPr>
-          <w:t>hs14</w:t>
-        </w:r>
-        <w:r>
-          <w:rPr>
-            <w:rStyle w:val="Hyperlink"/>
-            <w:color w:val="auto"/>
-            <w:sz w:val="22"/>
-            <w:u w:val="none"/>
-          </w:rPr>
-          <w:t>2</w:t>
-        </w:r>
-        <w:r>
-          <w:rPr>
-            <w:rStyle w:val="Hyperlink"/>
-            <w:color w:val="auto"/>
-            <w:sz w:val="22"/>
-            <w:u w:val="none"/>
-          </w:rPr>
-          <w:t>35.github.io</w:t>
+          <w:t>hs14235.github.io</w:t>
         </w:r>
       </w:hyperlink>
       <w:r>
@@ -120,27 +82,7 @@
             <w:szCs w:val="28"/>
             <w:u w:val="none"/>
           </w:rPr>
-          <w:t>githu</w:t>
-        </w:r>
-        <w:r>
-          <w:rPr>
-            <w:rStyle w:val="Hyperlink"/>
-            <w:color w:val="auto"/>
-            <w:sz w:val="22"/>
-            <w:szCs w:val="28"/>
-            <w:u w:val="none"/>
-          </w:rPr>
-          <w:t>b</w:t>
-        </w:r>
-        <w:r>
-          <w:rPr>
-            <w:rStyle w:val="Hyperlink"/>
-            <w:color w:val="auto"/>
-            <w:sz w:val="22"/>
-            <w:szCs w:val="28"/>
-            <w:u w:val="none"/>
-          </w:rPr>
-          <w:t>.com/hs14235</w:t>
+          <w:t>github.com/hs14235</w:t>
         </w:r>
       </w:hyperlink>
       <w:r>
@@ -249,7 +191,49 @@
           <w:sz w:val="22"/>
           <w:szCs w:val="28"/>
         </w:rPr>
-        <w:t xml:space="preserve">, PostgreSQL, React, and Docker. Builds tested systems spanning REST APIs, transactional data integrity, containerized environments, CI, applied AI, and interactive 3D workflows. Translates stakeholder requirements and independent research into ubiquitous implementations and practical, reliable solutions. </w:t>
+        <w:t>, PostgreSQL, React, and Docker. Builds tested systems spanning REST APIs,</w:t>
+      </w:r>
+      <w:r>
+        <w:rPr>
+          <w:sz w:val="22"/>
+          <w:szCs w:val="28"/>
+        </w:rPr>
+        <w:t xml:space="preserve"> </w:t>
+      </w:r>
+      <w:r>
+        <w:rPr>
+          <w:sz w:val="22"/>
+          <w:szCs w:val="28"/>
+        </w:rPr>
+        <w:t>data integrity, containerized environments,</w:t>
+      </w:r>
+      <w:r>
+        <w:rPr>
+          <w:sz w:val="22"/>
+          <w:szCs w:val="28"/>
+        </w:rPr>
+        <w:t xml:space="preserve"> </w:t>
+      </w:r>
+      <w:r>
+        <w:rPr>
+          <w:sz w:val="22"/>
+          <w:szCs w:val="28"/>
+        </w:rPr>
+        <w:t xml:space="preserve">applied AI, and interactive 3D workflows. Translates stakeholder requirements and </w:t>
+      </w:r>
+      <w:r>
+        <w:rPr>
+          <w:sz w:val="22"/>
+          <w:szCs w:val="28"/>
+        </w:rPr>
+        <w:t xml:space="preserve">applies engineering judgement to evolving problems, gauging emerging technologies and selecting practical, reliable solutions for the constraints at hand. </w:t>
+      </w:r>
+      <w:r>
+        <w:rPr>
+          <w:sz w:val="22"/>
+          <w:szCs w:val="28"/>
+        </w:rPr>
+        <w:t xml:space="preserve"> </w:t>
       </w:r>
     </w:p>
     <w:p>
@@ -519,23 +503,7 @@
           <w:sz w:val="22"/>
           <w:szCs w:val="28"/>
         </w:rPr>
-        <w:t xml:space="preserve"> </w:t>
-      </w:r>
-      <w:r>
-        <w:rPr>
-          <w:color w:val="111111"/>
-          <w:sz w:val="22"/>
-          <w:szCs w:val="28"/>
-        </w:rPr>
-        <w:t>PostgreSQL</w:t>
-      </w:r>
-      <w:r>
-        <w:rPr>
-          <w:color w:val="111111"/>
-          <w:sz w:val="22"/>
-          <w:szCs w:val="28"/>
-        </w:rPr>
-        <w:t>,</w:t>
+        <w:t xml:space="preserve"> PostgreSQL,</w:t>
       </w:r>
       <w:r>
         <w:rPr>
@@ -705,7 +673,79 @@
           <w:sz w:val="24"/>
           <w:szCs w:val="28"/>
         </w:rPr>
-        <w:t xml:space="preserve">Team Lead -  Gulfstream Aerospace Sponsored Senior Capstone                   </w:t>
+        <w:t xml:space="preserve">Technical </w:t>
+      </w:r>
+      <w:r>
+        <w:rPr>
+          <w:b/>
+          <w:color w:val="111111"/>
+          <w:sz w:val="24"/>
+          <w:szCs w:val="28"/>
+        </w:rPr>
+        <w:t xml:space="preserve">Team Lead </w:t>
+      </w:r>
+      <w:r>
+        <w:rPr>
+          <w:b/>
+          <w:color w:val="111111"/>
+          <w:sz w:val="24"/>
+          <w:szCs w:val="28"/>
+        </w:rPr>
+        <w:t>(</w:t>
+      </w:r>
+      <w:r>
+        <w:rPr>
+          <w:b/>
+          <w:color w:val="111111"/>
+          <w:sz w:val="24"/>
+          <w:szCs w:val="28"/>
+        </w:rPr>
+        <w:t>Gulfstream Aerospace Sponsored</w:t>
+      </w:r>
+      <w:r>
+        <w:rPr>
+          <w:b/>
+          <w:color w:val="111111"/>
+          <w:sz w:val="24"/>
+          <w:szCs w:val="28"/>
+        </w:rPr>
+        <w:t xml:space="preserve"> </w:t>
+      </w:r>
+      <w:r>
+        <w:rPr>
+          <w:b/>
+          <w:color w:val="111111"/>
+          <w:sz w:val="24"/>
+          <w:szCs w:val="28"/>
+        </w:rPr>
+        <w:t>Capstone</w:t>
+      </w:r>
+      <w:r>
+        <w:rPr>
+          <w:b/>
+          <w:color w:val="111111"/>
+          <w:sz w:val="24"/>
+          <w:szCs w:val="28"/>
+        </w:rPr>
+        <w:t>)</w:t>
+      </w:r>
+      <w:r>
+        <w:rPr>
+          <w:b/>
+          <w:color w:val="111111"/>
+          <w:sz w:val="24"/>
+          <w:szCs w:val="28"/>
+        </w:rPr>
+        <w:t xml:space="preserve">  </w:t>
+      </w:r>
+      <w:r>
+        <w:rPr>
+          <w:b/>
+          <w:color w:val="111111"/>
+          <w:sz w:val="24"/>
+          <w:szCs w:val="28"/>
+        </w:rPr>
+        <w:t xml:space="preserve">             </w:t>
       </w:r>
       <w:r>
         <w:rPr>
@@ -791,7 +831,16 @@
           <w:sz w:val="22"/>
           <w:szCs w:val="28"/>
         </w:rPr>
-        <w:t>Originated the platform</w:t>
+        <w:t>Defined</w:t>
+      </w:r>
+      <w:r>
+        <w:rPr>
+          <w:bCs/>
+          <w:color w:val="111111"/>
+          <w:sz w:val="22"/>
+          <w:szCs w:val="28"/>
+        </w:rPr>
+        <w:t xml:space="preserve"> the platform</w:t>
       </w:r>
       <w:r>
         <w:rPr>
@@ -1067,15 +1116,7 @@
           <w:sz w:val="22"/>
           <w:szCs w:val="28"/>
         </w:rPr>
-        <w:t>glTF 2.0</w:t>
-      </w:r>
-      <w:r>
-        <w:rPr>
-          <w:color w:val="111111"/>
-          <w:sz w:val="22"/>
-          <w:szCs w:val="28"/>
-        </w:rPr>
-        <w:t xml:space="preserve"> </w:t>
+        <w:t xml:space="preserve">glTF 2.0 </w:t>
       </w:r>
       <w:r>
         <w:rPr>
@@ -1392,29 +1433,7 @@
             <w:szCs w:val="28"/>
             <w:u w:val="none"/>
           </w:rPr>
-          <w:t>Trai</w:t>
-        </w:r>
-        <w:r>
-          <w:rPr>
-            <w:rStyle w:val="Hyperlink"/>
-            <w:b/>
-            <w:color w:val="000000" w:themeColor="text1"/>
-            <w:sz w:val="24"/>
-            <w:szCs w:val="28"/>
-            <w:u w:val="none"/>
-          </w:rPr>
-          <w:t>n</w:t>
-        </w:r>
-        <w:r>
-          <w:rPr>
-            <w:rStyle w:val="Hyperlink"/>
-            <w:b/>
-            <w:color w:val="000000" w:themeColor="text1"/>
-            <w:sz w:val="24"/>
-            <w:szCs w:val="28"/>
-            <w:u w:val="none"/>
-          </w:rPr>
-          <w:t>line</w:t>
+          <w:t>Trainline</w:t>
         </w:r>
       </w:hyperlink>
       <w:r>
@@ -1659,29 +1678,7 @@
             <w:szCs w:val="28"/>
             <w:u w:val="none"/>
           </w:rPr>
-          <w:t>meeting-to-t</w:t>
-        </w:r>
-        <w:r>
-          <w:rPr>
-            <w:rStyle w:val="Hyperlink"/>
-            <w:b/>
-            <w:color w:val="auto"/>
-            <w:sz w:val="24"/>
-            <w:szCs w:val="28"/>
-            <w:u w:val="none"/>
-          </w:rPr>
-          <w:t>a</w:t>
-        </w:r>
-        <w:r>
-          <w:rPr>
-            <w:rStyle w:val="Hyperlink"/>
-            <w:b/>
-            <w:color w:val="auto"/>
-            <w:sz w:val="24"/>
-            <w:szCs w:val="28"/>
-            <w:u w:val="none"/>
-          </w:rPr>
-          <w:t>sks</w:t>
+          <w:t>meeting-to-tasks</w:t>
         </w:r>
       </w:hyperlink>
       <w:r>
@@ -1708,7 +1705,25 @@
           <w:sz w:val="22"/>
           <w:szCs w:val="28"/>
         </w:rPr>
-        <w:t>, FAISS, Ollama, GitHub REST API</w:t>
+        <w:t xml:space="preserve">, FAISS, </w:t>
+      </w:r>
+      <w:proofErr w:type="spellStart"/>
+      <w:r>
+        <w:rPr>
+          <w:color w:val="111111"/>
+          <w:sz w:val="22"/>
+          <w:szCs w:val="28"/>
+        </w:rPr>
+        <w:t>Ollama</w:t>
+      </w:r>
+      <w:proofErr w:type="spellEnd"/>
+      <w:r>
+        <w:rPr>
+          <w:color w:val="111111"/>
+          <w:sz w:val="22"/>
+          <w:szCs w:val="28"/>
+        </w:rPr>
+        <w:t>, GitHub REST API</w:t>
       </w:r>
       <w:r>
         <w:rPr>
@@ -1717,7 +1732,7 @@
           <w:sz w:val="22"/>
           <w:szCs w:val="28"/>
         </w:rPr>
-        <w:t xml:space="preserve">                                                         </w:t>
+        <w:t xml:space="preserve">                                     </w:t>
       </w:r>
       <w:r>
         <w:rPr>
@@ -1736,6 +1751,15 @@
           <w:szCs w:val="28"/>
         </w:rPr>
         <w:t xml:space="preserve"> 2025</w:t>
+      </w:r>
+      <w:r>
+        <w:rPr>
+          <w:b/>
+          <w:color w:val="111111"/>
+          <w:sz w:val="22"/>
+          <w:szCs w:val="28"/>
+        </w:rPr>
+        <w:t xml:space="preserve"> – Aug 2026 </w:t>
       </w:r>
     </w:p>
     <w:p>
@@ -3004,6 +3028,7 @@
   <w:style w:type="character" w:default="1" w:styleId="DefaultParagraphFont">
     <w:name w:val="Default Paragraph Font"/>
     <w:uiPriority w:val="1"/>
+    <w:semiHidden/>
     <w:unhideWhenUsed/>
   </w:style>
   <w:style w:type="table" w:default="1" w:styleId="TableNormal">

</xml_diff>